<commit_message>
fixed problem due to the fact that kmeans might generate less than k centers
</commit_message>
<xml_diff>
--- a/G89HW2form.docx
+++ b/G89HW2form.docx
@@ -8,7 +8,6 @@
           <w:color w:val="FF0000"/>
           <w:sz w:val="20"/>
           <w:szCs w:val="20"/>
-          <w:lang w:val="en-US"/>
         </w:rPr>
       </w:pPr>
       <w:r>
@@ -16,7 +15,6 @@
           <w:b/>
           <w:sz w:val="20"/>
           <w:szCs w:val="20"/>
-          <w:lang w:val="en-US"/>
         </w:rPr>
         <w:t>GROUP NUMBER:</w:t>
       </w:r>
@@ -25,7 +23,6 @@
           <w:b/>
           <w:sz w:val="20"/>
           <w:szCs w:val="20"/>
-          <w:lang w:val="en-US"/>
         </w:rPr>
         <w:t xml:space="preserve"> 89</w:t>
       </w:r>
@@ -405,6 +402,30 @@
           <w:lang w:val="en-US"/>
         </w:rPr>
         <w:t>Name of used file:</w:t>
+      </w:r>
+      <w:r>
+        <w:rPr>
+          <w:sz w:val="20"/>
+          <w:szCs w:val="20"/>
+          <w:lang w:val="en-US"/>
+        </w:rPr>
+        <w:t xml:space="preserve"> </w:t>
+      </w:r>
+      <w:r>
+        <w:rPr>
+          <w:sz w:val="20"/>
+          <w:szCs w:val="20"/>
+          <w:lang w:val="en-US"/>
+        </w:rPr>
+        <w:t>/</w:t>
+      </w:r>
+      <w:r>
+        <w:rPr>
+          <w:sz w:val="20"/>
+          <w:szCs w:val="20"/>
+          <w:lang w:val="en-GB"/>
+        </w:rPr>
+        <w:t>data/BDC2425/artificial4M7D100K.txt</w:t>
       </w:r>
     </w:p>
     <w:tbl>
@@ -595,9 +616,20 @@
             <w:tcW w:w="1843" w:type="dxa"/>
           </w:tcPr>
           <w:p>
-            <w:r>
-              <w:t xml:space="preserve"> </w:t>
-            </w:r>
+            <w:pPr>
+              <w:tabs>
+                <w:tab w:val="center" w:pos="813"/>
+              </w:tabs>
+              <w:jc w:val="center"/>
+            </w:pPr>
+            <w:r>
+              <w:t xml:space="preserve">17492 </w:t>
+            </w:r>
+            <w:proofErr w:type="spellStart"/>
+            <w:r>
+              <w:t>ms</w:t>
+            </w:r>
+            <w:proofErr w:type="spellEnd"/>
           </w:p>
         </w:tc>
         <w:tc>
@@ -605,9 +637,20 @@
             <w:tcW w:w="1843" w:type="dxa"/>
           </w:tcPr>
           <w:p>
-            <w:r>
-              <w:t xml:space="preserve"> </w:t>
-            </w:r>
+            <w:pPr>
+              <w:jc w:val="center"/>
+            </w:pPr>
+            <w:r>
+              <w:t xml:space="preserve">87690 </w:t>
+            </w:r>
+            <w:proofErr w:type="spellStart"/>
+            <w:r>
+              <w:t>m</w:t>
+            </w:r>
+            <w:r>
+              <w:t>s</w:t>
+            </w:r>
+            <w:proofErr w:type="spellEnd"/>
           </w:p>
         </w:tc>
         <w:tc>
@@ -615,9 +658,25 @@
             <w:tcW w:w="2693" w:type="dxa"/>
           </w:tcPr>
           <w:p>
+            <w:pPr>
+              <w:tabs>
+                <w:tab w:val="center" w:pos="1238"/>
+              </w:tabs>
+            </w:pPr>
             <w:r>
               <w:t xml:space="preserve"> </w:t>
             </w:r>
+            <w:r>
+              <w:tab/>
+            </w:r>
+            <w:r>
+              <w:t xml:space="preserve">9287 </w:t>
+            </w:r>
+            <w:proofErr w:type="spellStart"/>
+            <w:r>
+              <w:t>ms</w:t>
+            </w:r>
+            <w:proofErr w:type="spellEnd"/>
           </w:p>
         </w:tc>
       </w:tr>
@@ -640,9 +699,20 @@
             <w:tcW w:w="1843" w:type="dxa"/>
           </w:tcPr>
           <w:p>
-            <w:r>
-              <w:t xml:space="preserve"> </w:t>
-            </w:r>
+            <w:pPr>
+              <w:tabs>
+                <w:tab w:val="center" w:pos="813"/>
+              </w:tabs>
+              <w:jc w:val="center"/>
+            </w:pPr>
+            <w:r>
+              <w:t xml:space="preserve">15343 </w:t>
+            </w:r>
+            <w:proofErr w:type="spellStart"/>
+            <w:r>
+              <w:t>ms</w:t>
+            </w:r>
+            <w:proofErr w:type="spellEnd"/>
           </w:p>
         </w:tc>
         <w:tc>
@@ -650,9 +720,20 @@
             <w:tcW w:w="1843" w:type="dxa"/>
           </w:tcPr>
           <w:p>
-            <w:r>
-              <w:t xml:space="preserve"> </w:t>
-            </w:r>
+            <w:pPr>
+              <w:tabs>
+                <w:tab w:val="center" w:pos="813"/>
+              </w:tabs>
+              <w:jc w:val="center"/>
+            </w:pPr>
+            <w:r>
+              <w:t xml:space="preserve">46109 </w:t>
+            </w:r>
+            <w:proofErr w:type="spellStart"/>
+            <w:r>
+              <w:t>ms</w:t>
+            </w:r>
+            <w:proofErr w:type="spellEnd"/>
           </w:p>
         </w:tc>
         <w:tc>
@@ -660,9 +741,20 @@
             <w:tcW w:w="2693" w:type="dxa"/>
           </w:tcPr>
           <w:p>
-            <w:r>
-              <w:t xml:space="preserve"> </w:t>
-            </w:r>
+            <w:pPr>
+              <w:tabs>
+                <w:tab w:val="left" w:pos="813"/>
+              </w:tabs>
+              <w:jc w:val="center"/>
+            </w:pPr>
+            <w:r>
+              <w:t xml:space="preserve">4806 </w:t>
+            </w:r>
+            <w:proofErr w:type="spellStart"/>
+            <w:r>
+              <w:t>ms</w:t>
+            </w:r>
+            <w:proofErr w:type="spellEnd"/>
           </w:p>
         </w:tc>
       </w:tr>
@@ -685,9 +777,20 @@
             <w:tcW w:w="1843" w:type="dxa"/>
           </w:tcPr>
           <w:p>
+            <w:pPr>
+              <w:jc w:val="center"/>
+            </w:pPr>
+            <w:r>
+              <w:t>11191</w:t>
+            </w:r>
             <w:r>
               <w:t xml:space="preserve"> </w:t>
             </w:r>
+            <w:proofErr w:type="spellStart"/>
+            <w:r>
+              <w:t>ms</w:t>
+            </w:r>
+            <w:proofErr w:type="spellEnd"/>
           </w:p>
         </w:tc>
         <w:tc>
@@ -695,9 +798,17 @@
             <w:tcW w:w="1843" w:type="dxa"/>
           </w:tcPr>
           <w:p>
-            <w:r>
-              <w:t xml:space="preserve"> </w:t>
-            </w:r>
+            <w:pPr>
+              <w:jc w:val="center"/>
+            </w:pPr>
+            <w:r>
+              <w:t xml:space="preserve">23463 </w:t>
+            </w:r>
+            <w:proofErr w:type="spellStart"/>
+            <w:r>
+              <w:t>ms</w:t>
+            </w:r>
+            <w:proofErr w:type="spellEnd"/>
           </w:p>
         </w:tc>
         <w:tc>
@@ -705,9 +816,17 @@
             <w:tcW w:w="2693" w:type="dxa"/>
           </w:tcPr>
           <w:p>
-            <w:r>
-              <w:t xml:space="preserve"> </w:t>
-            </w:r>
+            <w:pPr>
+              <w:jc w:val="center"/>
+            </w:pPr>
+            <w:r>
+              <w:t xml:space="preserve">2562 </w:t>
+            </w:r>
+            <w:proofErr w:type="spellStart"/>
+            <w:r>
+              <w:t>ms</w:t>
+            </w:r>
+            <w:proofErr w:type="spellEnd"/>
           </w:p>
         </w:tc>
       </w:tr>
@@ -729,19 +848,64 @@
           <w:tcPr>
             <w:tcW w:w="1843" w:type="dxa"/>
           </w:tcPr>
-          <w:p/>
+          <w:p>
+            <w:pPr>
+              <w:jc w:val="center"/>
+            </w:pPr>
+            <w:r>
+              <w:t>5748</w:t>
+            </w:r>
+            <w:r>
+              <w:t xml:space="preserve"> </w:t>
+            </w:r>
+            <w:proofErr w:type="spellStart"/>
+            <w:r>
+              <w:t>ms</w:t>
+            </w:r>
+            <w:proofErr w:type="spellEnd"/>
+          </w:p>
         </w:tc>
         <w:tc>
           <w:tcPr>
             <w:tcW w:w="1843" w:type="dxa"/>
           </w:tcPr>
-          <w:p/>
+          <w:p>
+            <w:pPr>
+              <w:jc w:val="center"/>
+            </w:pPr>
+            <w:r>
+              <w:t>14127</w:t>
+            </w:r>
+            <w:r>
+              <w:t xml:space="preserve"> </w:t>
+            </w:r>
+            <w:proofErr w:type="spellStart"/>
+            <w:r>
+              <w:t>ms</w:t>
+            </w:r>
+            <w:proofErr w:type="spellEnd"/>
+          </w:p>
         </w:tc>
         <w:tc>
           <w:tcPr>
             <w:tcW w:w="2693" w:type="dxa"/>
           </w:tcPr>
-          <w:p/>
+          <w:p>
+            <w:pPr>
+              <w:jc w:val="center"/>
+            </w:pPr>
+            <w:r>
+              <w:t>1689</w:t>
+            </w:r>
+            <w:r>
+              <w:t xml:space="preserve"> </w:t>
+            </w:r>
+            <w:proofErr w:type="spellStart"/>
+            <w:r>
+              <w:t>ms</w:t>
+            </w:r>
+            <w:proofErr w:type="spellEnd"/>
+          </w:p>
         </w:tc>
       </w:tr>
     </w:tbl>
@@ -1067,13 +1231,413 @@
     <w:p>
       <w:pPr>
         <w:rPr>
-          <w:b/>
-          <w:bCs/>
-          <w:sz w:val="20"/>
-          <w:szCs w:val="20"/>
-          <w:lang w:val="en-US"/>
-        </w:rPr>
-      </w:pPr>
+          <w:sz w:val="20"/>
+          <w:szCs w:val="20"/>
+          <w:lang w:val="en-US"/>
+        </w:rPr>
+      </w:pPr>
+    </w:p>
+    <w:p>
+      <w:pPr>
+        <w:rPr>
+          <w:sz w:val="20"/>
+          <w:szCs w:val="20"/>
+          <w:lang w:val="en-US"/>
+        </w:rPr>
+      </w:pPr>
+      <w:r>
+        <w:rPr>
+          <w:sz w:val="20"/>
+          <w:szCs w:val="20"/>
+          <w:lang w:val="en-US"/>
+        </w:rPr>
+        <w:t xml:space="preserve">To implement the program G89GEN.java we took the cue from the paper regarding Socially Fair k-means Clustering. </w:t>
+      </w:r>
+    </w:p>
+    <w:p>
+      <w:pPr>
+        <w:rPr>
+          <w:sz w:val="20"/>
+          <w:szCs w:val="20"/>
+          <w:lang w:val="en-US"/>
+        </w:rPr>
+      </w:pPr>
+      <w:r>
+        <w:rPr>
+          <w:sz w:val="20"/>
+          <w:szCs w:val="20"/>
+          <w:lang w:val="en-US"/>
+        </w:rPr>
+        <w:t xml:space="preserve">If we consider just one cluster, the idea is to put just one point of class “A” in position (-10, 0) and all the remaining N-1 points in position (10, 0) with label “B”. </w:t>
+      </w:r>
+      <w:r>
+        <w:rPr>
+          <w:sz w:val="20"/>
+          <w:szCs w:val="20"/>
+          <w:lang w:val="en-US"/>
+        </w:rPr>
+        <w:t xml:space="preserve">For this </w:t>
+      </w:r>
+      <w:r>
+        <w:rPr>
+          <w:sz w:val="20"/>
+          <w:szCs w:val="20"/>
+          <w:lang w:val="en-US"/>
+        </w:rPr>
+        <w:t>reason,</w:t>
+      </w:r>
+      <w:r>
+        <w:rPr>
+          <w:sz w:val="20"/>
+          <w:szCs w:val="20"/>
+          <w:lang w:val="en-US"/>
+        </w:rPr>
+        <w:t xml:space="preserve"> t</w:t>
+      </w:r>
+      <w:r>
+        <w:rPr>
+          <w:sz w:val="20"/>
+          <w:szCs w:val="20"/>
+          <w:lang w:val="en-US"/>
+        </w:rPr>
+        <w:t>he mini</w:t>
+      </w:r>
+      <w:r>
+        <w:rPr>
+          <w:sz w:val="20"/>
+          <w:szCs w:val="20"/>
+          <w:lang w:val="en-US"/>
+        </w:rPr>
+        <w:t>mum number of points that is needed</w:t>
+      </w:r>
+      <w:r>
+        <w:rPr>
+          <w:sz w:val="20"/>
+          <w:szCs w:val="20"/>
+          <w:lang w:val="en-US"/>
+        </w:rPr>
+        <w:t xml:space="preserve"> to see a clear difference in the loss functions</w:t>
+      </w:r>
+      <w:r>
+        <w:rPr>
+          <w:sz w:val="20"/>
+          <w:szCs w:val="20"/>
+          <w:lang w:val="en-US"/>
+        </w:rPr>
+        <w:t xml:space="preserve"> for K clusters is N = 3K (so in each cluster you have one point of class A and two points of class B). </w:t>
+      </w:r>
+    </w:p>
+    <w:p>
+      <w:pPr>
+        <w:rPr>
+          <w:sz w:val="20"/>
+          <w:szCs w:val="20"/>
+          <w:lang w:val="en-US"/>
+        </w:rPr>
+      </w:pPr>
+      <w:r>
+        <w:rPr>
+          <w:sz w:val="20"/>
+          <w:szCs w:val="20"/>
+          <w:lang w:val="en-US"/>
+        </w:rPr>
+        <w:t xml:space="preserve">By </w:t>
+      </w:r>
+      <w:r>
+        <w:rPr>
+          <w:sz w:val="20"/>
+          <w:szCs w:val="20"/>
+          <w:lang w:val="en-US"/>
+        </w:rPr>
+        <w:t xml:space="preserve">placing the points in the way descripted above, </w:t>
+      </w:r>
+      <w:r>
+        <w:rPr>
+          <w:sz w:val="20"/>
+          <w:szCs w:val="20"/>
+          <w:lang w:val="en-US"/>
+        </w:rPr>
+        <w:t>the Lloyd’s algorithm won’t consider the demographic classes and so it will produce a centroid very unbalanced towards class “B”, instead the Fair algorithm will give more importance to the point of class “A” by producing a centroid a little closer to this point.</w:t>
+      </w:r>
+    </w:p>
+    <w:p>
+      <w:pPr>
+        <w:rPr>
+          <w:sz w:val="20"/>
+          <w:szCs w:val="20"/>
+          <w:lang w:val="en-US"/>
+        </w:rPr>
+      </w:pPr>
+      <w:r>
+        <w:rPr>
+          <w:sz w:val="20"/>
+          <w:szCs w:val="20"/>
+          <w:lang w:val="en-US"/>
+        </w:rPr>
+        <w:t xml:space="preserve">If we want more clusters, we reproduce the exact </w:t>
+      </w:r>
+      <w:r>
+        <w:rPr>
+          <w:sz w:val="20"/>
+          <w:szCs w:val="20"/>
+          <w:lang w:val="en-US"/>
+        </w:rPr>
+        <w:t>setting,</w:t>
+      </w:r>
+      <w:r>
+        <w:rPr>
+          <w:sz w:val="20"/>
+          <w:szCs w:val="20"/>
+          <w:lang w:val="en-US"/>
+        </w:rPr>
+        <w:t xml:space="preserve"> but we place the points with a vertical space of 10 above the previous generated ones. So, the points of the </w:t>
+      </w:r>
+      <w:proofErr w:type="spellStart"/>
+      <w:r>
+        <w:rPr>
+          <w:sz w:val="20"/>
+          <w:szCs w:val="20"/>
+          <w:lang w:val="en-US"/>
+        </w:rPr>
+        <w:t>i-th</w:t>
+      </w:r>
+      <w:proofErr w:type="spellEnd"/>
+      <w:r>
+        <w:rPr>
+          <w:sz w:val="20"/>
+          <w:szCs w:val="20"/>
+          <w:lang w:val="en-US"/>
+        </w:rPr>
+        <w:t xml:space="preserve"> cluster will be in position (-10, 30*</w:t>
+      </w:r>
+      <w:proofErr w:type="spellStart"/>
+      <w:r>
+        <w:rPr>
+          <w:sz w:val="20"/>
+          <w:szCs w:val="20"/>
+          <w:lang w:val="en-US"/>
+        </w:rPr>
+        <w:t>i</w:t>
+      </w:r>
+      <w:proofErr w:type="spellEnd"/>
+      <w:r>
+        <w:rPr>
+          <w:sz w:val="20"/>
+          <w:szCs w:val="20"/>
+          <w:lang w:val="en-US"/>
+        </w:rPr>
+        <w:t>) (class “A”) and (10, 30*</w:t>
+      </w:r>
+      <w:proofErr w:type="spellStart"/>
+      <w:r>
+        <w:rPr>
+          <w:sz w:val="20"/>
+          <w:szCs w:val="20"/>
+          <w:lang w:val="en-US"/>
+        </w:rPr>
+        <w:t>i</w:t>
+      </w:r>
+      <w:proofErr w:type="spellEnd"/>
+      <w:r>
+        <w:rPr>
+          <w:sz w:val="20"/>
+          <w:szCs w:val="20"/>
+          <w:lang w:val="en-US"/>
+        </w:rPr>
+        <w:t xml:space="preserve">) (class “B”). </w:t>
+      </w:r>
+    </w:p>
+    <w:p>
+      <w:pPr>
+        <w:rPr>
+          <w:sz w:val="20"/>
+          <w:szCs w:val="20"/>
+          <w:lang w:val="en-US"/>
+        </w:rPr>
+      </w:pPr>
+      <w:r>
+        <w:rPr>
+          <w:sz w:val="20"/>
+          <w:szCs w:val="20"/>
+          <w:lang w:val="en-US"/>
+        </w:rPr>
+        <w:t xml:space="preserve">By doing so the Lloyd’s algorithm produces centroids that discriminate the minority class “A”, thus producing a higher Fair Objective with respect to the Fair variant. </w:t>
+      </w:r>
+    </w:p>
+    <w:p>
+      <w:pPr>
+        <w:rPr>
+          <w:sz w:val="20"/>
+          <w:szCs w:val="20"/>
+          <w:lang w:val="en-US"/>
+        </w:rPr>
+      </w:pPr>
+      <w:r>
+        <w:rPr>
+          <w:sz w:val="20"/>
+          <w:szCs w:val="20"/>
+          <w:lang w:val="en-US"/>
+        </w:rPr>
+        <w:t>The specifical positions of the points is not important, but the key is the proportion among the horizontal distance</w:t>
+      </w:r>
+      <w:r>
+        <w:rPr>
+          <w:sz w:val="20"/>
+          <w:szCs w:val="20"/>
+          <w:lang w:val="en-US"/>
+        </w:rPr>
+        <w:t>s</w:t>
+      </w:r>
+      <w:r>
+        <w:rPr>
+          <w:sz w:val="20"/>
+          <w:szCs w:val="20"/>
+          <w:lang w:val="en-US"/>
+        </w:rPr>
+        <w:t xml:space="preserve"> between points of different class and the vertical distance between points belonging to the same class. </w:t>
+      </w:r>
+      <w:proofErr w:type="gramStart"/>
+      <w:r>
+        <w:rPr>
+          <w:sz w:val="20"/>
+          <w:szCs w:val="20"/>
+          <w:lang w:val="en-US"/>
+        </w:rPr>
+        <w:t>In particular</w:t>
+      </w:r>
+      <w:r>
+        <w:rPr>
+          <w:sz w:val="20"/>
+          <w:szCs w:val="20"/>
+          <w:lang w:val="en-US"/>
+        </w:rPr>
+        <w:t>,</w:t>
+      </w:r>
+      <w:r>
+        <w:rPr>
+          <w:sz w:val="20"/>
+          <w:szCs w:val="20"/>
+          <w:lang w:val="en-US"/>
+        </w:rPr>
+        <w:t xml:space="preserve"> </w:t>
+      </w:r>
+      <w:r>
+        <w:rPr>
+          <w:sz w:val="20"/>
+          <w:szCs w:val="20"/>
+          <w:lang w:val="en-US"/>
+        </w:rPr>
+        <w:lastRenderedPageBreak/>
+        <w:t>to</w:t>
+      </w:r>
+      <w:proofErr w:type="gramEnd"/>
+      <w:r>
+        <w:rPr>
+          <w:sz w:val="20"/>
+          <w:szCs w:val="20"/>
+          <w:lang w:val="en-US"/>
+        </w:rPr>
+        <w:t xml:space="preserve"> show an evident difference in the </w:t>
+      </w:r>
+      <w:r>
+        <w:rPr>
+          <w:sz w:val="20"/>
+          <w:szCs w:val="20"/>
+          <w:lang w:val="en-US"/>
+        </w:rPr>
+        <w:t>loss</w:t>
+      </w:r>
+      <w:r>
+        <w:rPr>
+          <w:sz w:val="20"/>
+          <w:szCs w:val="20"/>
+          <w:lang w:val="en-US"/>
+        </w:rPr>
+        <w:t xml:space="preserve"> functions</w:t>
+      </w:r>
+      <w:r>
+        <w:rPr>
+          <w:sz w:val="20"/>
+          <w:szCs w:val="20"/>
+          <w:lang w:val="en-US"/>
+        </w:rPr>
+        <w:t>,</w:t>
+      </w:r>
+      <w:r>
+        <w:rPr>
+          <w:sz w:val="20"/>
+          <w:szCs w:val="20"/>
+          <w:lang w:val="en-US"/>
+        </w:rPr>
+        <w:t xml:space="preserve"> the vertical distance should be greater than the horizontal one. </w:t>
+      </w:r>
+      <w:r>
+        <w:rPr>
+          <w:sz w:val="20"/>
+          <w:szCs w:val="20"/>
+          <w:lang w:val="en-US"/>
+        </w:rPr>
+        <w:t>We’ve noticed that if the horizontal distance between points is 20 and the vertical distance is 21, then if we use N = 3K, the fair loss computed with the centroids produced by the Lloyd’s algorithm is about 17</w:t>
+      </w:r>
+      <w:r>
+        <w:rPr>
+          <w:sz w:val="20"/>
+          <w:szCs w:val="20"/>
+          <w:lang w:val="en-US"/>
+        </w:rPr>
+        <w:t>0</w:t>
+      </w:r>
+      <w:r>
+        <w:rPr>
+          <w:sz w:val="20"/>
+          <w:szCs w:val="20"/>
+          <w:lang w:val="en-US"/>
+        </w:rPr>
+        <w:t xml:space="preserve">, meanwhile the one computed with fair centroids is about 100. </w:t>
+      </w:r>
+      <w:r>
+        <w:rPr>
+          <w:sz w:val="20"/>
+          <w:szCs w:val="20"/>
+          <w:lang w:val="en-US"/>
+        </w:rPr>
+        <w:t xml:space="preserve">What happens is that the losses in this case vary a lot around these mean values, but if we increase the vertical distance and we set it to 30, then the two losses stabilize: 177 for the one computed on Lloyd’s centroids and 100 for the one computed on fair centroids. </w:t>
+      </w:r>
+    </w:p>
+    <w:p>
+      <w:pPr>
+        <w:rPr>
+          <w:sz w:val="20"/>
+          <w:szCs w:val="20"/>
+          <w:lang w:val="en-US"/>
+        </w:rPr>
+      </w:pPr>
+      <w:r>
+        <w:rPr>
+          <w:sz w:val="20"/>
+          <w:szCs w:val="20"/>
+          <w:lang w:val="en-US"/>
+        </w:rPr>
+        <w:t xml:space="preserve">If we increase more the vertical distance the two losses remain the same. </w:t>
+      </w:r>
+      <w:proofErr w:type="gramStart"/>
+      <w:r>
+        <w:rPr>
+          <w:sz w:val="20"/>
+          <w:szCs w:val="20"/>
+          <w:lang w:val="en-US"/>
+        </w:rPr>
+        <w:t>In order to</w:t>
+      </w:r>
+      <w:proofErr w:type="gramEnd"/>
+      <w:r>
+        <w:rPr>
+          <w:sz w:val="20"/>
+          <w:szCs w:val="20"/>
+          <w:lang w:val="en-US"/>
+        </w:rPr>
+        <w:t xml:space="preserve"> increase their difference, we need to use a larger N.</w:t>
+      </w:r>
     </w:p>
     <w:p>
       <w:pPr>

</xml_diff>